<commit_message>
Add signed Android updates and contact call notices
</commit_message>
<xml_diff>
--- a/docs/phone_guide.docx
+++ b/docs/phone_guide.docx
@@ -38,6 +38,29 @@
         <w:pStyle w:val="Heading1"/>
       </w:pPr>
       <w:r>
+        <w:t>Missed calls and callback requests</w:t>
+      </w:r>
+    </w:p>
+    <w:p>
+      <w:r>
+        <w:t>A red missed-call arrow and count on a contact portrait show calls you did not answer. A green return arrow means that person has asked you to call back; a green outgoing arrow means your request is pending. Tap the callback icon beside the name for details or to clear missed calls.</w:t>
+      </w:r>
+    </w:p>
+    <w:p>
+      <w:r>
+        <w:t>For an offline contact, tap the callback icon and choose Request callback. After an unanswered outgoing call, the app also offers Request callback. This sends a request through the Zmala server; it does not place another call. Repeated requests remain one pending request for the pair.</w:t>
+      </w:r>
+    </w:p>
+    <w:p>
+      <w:r>
+        <w:t>When the contact becomes available, tap their green name to call. A connected call completes pending callback requests between you and clears your missed-call count for that person. The administrator controls request expiry. If the action is absent, the server needs an update to support app callbacks.</w:t>
+      </w:r>
+    </w:p>
+    <w:p>
+      <w:pPr>
+        <w:pStyle w:val="Heading1"/>
+      </w:pPr>
+      <w:r>
         <w:t>Answer an incoming call</w:t>
       </w:r>
     </w:p>
@@ -54,6 +77,20 @@
     <w:p>
       <w:pPr>
         <w:pStyle w:val="Heading1"/>
+      </w:pPr>
+      <w:r>
+        <w:t>Reset setup only when needed</w:t>
+      </w:r>
+    </w:p>
+    <w:p>
+      <w:r>
+        <w:t>To deliberately remove setup, use Android Settings &gt; Apps &gt; ZmalaPhone &gt; Storage &gt; Clear storage (sometimes Clear app data). This requires a setup QR again and does not delete the server account. Do not clear data as the first response to a temporary network problem.</w:t>
+      </w:r>
+    </w:p>
+    <w:p>
+      <w:pPr>
+        <w:pStyle w:val="Heading1"/>
+        <w:pageBreakBefore/>
       </w:pPr>
       <w:r>
         <w:t>During a call</w:t>
@@ -77,7 +114,6 @@
     <w:p>
       <w:pPr>
         <w:pStyle w:val="Heading1"/>
-        <w:pageBreakBefore/>
       </w:pPr>
       <w:r>
         <w:t>When something is not working</w:t>
@@ -108,17 +144,27 @@
         <w:pStyle w:val="Heading1"/>
       </w:pPr>
       <w:r>
-        <w:t>Updates and deliberate setup changes</w:t>
+        <w:t>Updates</w:t>
       </w:r>
     </w:p>
     <w:p>
       <w:r>
-        <w:t>Install a newer signed ZmalaPhone.apk over the existing release to preserve setup. See ZmalaPhone-Installation.pdf before replacing a development copy.</w:t>
+        <w:t>The installed version appears discreetly at the bottom of the contact screen, beside Updates. Tap Updates to check now. When a newer published version is available, choose Update or Later. Later postpones reminders and automatic updates for a day.</w:t>
       </w:r>
     </w:p>
     <w:p>
       <w:r>
-        <w:t>To deliberately remove setup, use Android Settings &gt; Apps &gt; ZmalaPhone &gt; Storage &gt; Clear storage (sometimes Clear app data). This requires a setup QR again and does not delete the server account. Do not clear data as the first response to a temporary network problem.</w:t>
+        <w:t>Allow installation from ZmalaPhone when Android opens Settings, then return and tap Update. Android 9 to 11 requires confirmation. Updates preserve your setup. If your older app has no Updates button, install one APK manually first; see ZmalaPhone-Installation.pdf.</w:t>
+      </w:r>
+    </w:p>
+    <w:p>
+      <w:r>
+        <w:t>On Android 12 or later, Automatic updates on Wi-Fi is optional and initially off. It requires installation permission, an unmetered connection and 30 seconds with the app open and idle. If Android still requires approval, tap Update to continue.</w:t>
+      </w:r>
+    </w:p>
+    <w:p>
+      <w:r>
+        <w:t>Updates wait during calls. Downloads pause when a call starts or you leave the app; reopen Updates to continue. Calls are briefly unavailable during installation. Do not uninstall the app for ordinary updates.</w:t>
       </w:r>
     </w:p>
     <w:sectPr>

</xml_diff>

<commit_message>
Add callback cancellation, portrait contacts and app setup download steps
</commit_message>
<xml_diff>
--- a/docs/phone_guide.docx
+++ b/docs/phone_guide.docx
@@ -25,7 +25,7 @@
     </w:p>
     <w:p>
       <w:r>
-        <w:t>Contacts appear with a photo and name. A green name means the contact is online: tap it to call. A gray name means offline and cannot be tapped to start a call. Scroll when there are more contacts than fit on screen.</w:t>
+        <w:t>The contact screen stays in portrait. Contacts appear with a photo and name. A green name means the contact is online: tap it to call. A gray name means offline and cannot be tapped to start a call. Scroll when there are more contacts than fit on screen.</w:t>
       </w:r>
     </w:p>
     <w:p>
@@ -43,12 +43,12 @@
     </w:p>
     <w:p>
       <w:r>
-        <w:t>A red missed-call arrow and count on a contact portrait show calls you did not answer. A green return arrow means that person has asked you to call back; a green outgoing arrow means your request is pending. Tap the callback icon beside the name for details or to clear missed calls.</w:t>
+        <w:t>A red missed-call arrow and count on a contact portrait show calls you did not answer. A green return arrow means that person has asked you to call back; a green outgoing arrow means your request is pending. Tap the portrait for details or to clear missed calls.</w:t>
       </w:r>
     </w:p>
     <w:p>
       <w:r>
-        <w:t>For an offline contact, tap the callback icon and choose Request callback. After an unanswered outgoing call, the app also offers Request callback. This sends a request through the Zmala server; it does not place another call. Repeated requests remain one pending request for the pair.</w:t>
+        <w:t>For an offline contact, tap the callback icon and choose Request callback. After an unanswered outgoing call, the app also offers Request callback. This sends a request through the Zmala server; it does not place another call. While your request is pending, the button becomes an X. Tap it to cancel the request; the callback button returns. This does not end or place a call.</w:t>
       </w:r>
     </w:p>
     <w:p>

</xml_diff>

<commit_message>
Distinguish active contacts from unconfirmed push availability
</commit_message>
<xml_diff>
--- a/docs/phone_guide.docx
+++ b/docs/phone_guide.docx
@@ -25,7 +25,7 @@
     </w:p>
     <w:p>
       <w:r>
-        <w:t>The contact screen stays in portrait. Contacts appear with a photo and name. A green name means the contact is online: tap it to call. A gray name means offline and cannot be tapped to start a call. Scroll when there are more contacts than fit on screen.</w:t>
+        <w:t>The contact screen stays in portrait. Contacts appear with a photo and name. Green Available means the contact was recently active. Blue Try calling means push may reach their phone, but this is unconfirmed. Tap either to try a call. Red Offline means no current connection or usable push registration; it cannot start a call. The status appears below the name. Scroll when there are more contacts than fit on screen.</w:t>
       </w:r>
     </w:p>
     <w:p>
@@ -53,7 +53,7 @@
     </w:p>
     <w:p>
       <w:r>
-        <w:t>When the contact becomes available, tap their green name to call. A connected call completes pending callback requests between you and clears your missed-call count for that person. The administrator controls request expiry. If the action is absent, the server needs an update to support app callbacks.</w:t>
+        <w:t>When the contact becomes available, tap their green Available or blue Try calling name to call. A connected call completes pending callback requests between you and clears your missed-call count for that person. The administrator controls request expiry. If the action is absent, the server needs an update to support app callbacks.</w:t>
       </w:r>
     </w:p>
     <w:p>
@@ -90,7 +90,6 @@
     <w:p>
       <w:pPr>
         <w:pStyle w:val="Heading1"/>
-        <w:pageBreakBefore/>
       </w:pPr>
       <w:r>
         <w:t>During a call</w:t>

</xml_diff>

<commit_message>
Separate call audio controls and preserve camera preview proportions
</commit_message>
<xml_diff>
--- a/docs/phone_guide.docx
+++ b/docs/phone_guide.docx
@@ -24,11 +24,17 @@
       </w:r>
     </w:p>
     <w:p>
+      <w:pPr>
+        <w:keepLines/>
+      </w:pPr>
       <w:r>
         <w:t>The contact screen stays in portrait. Contacts appear with a photo and name. Green Available means the contact was recently active. Blue Try calling means push may reach their phone, but this is unconfirmed. Tap either to try a call. Red Offline means no current connection or usable push registration; it cannot start a call. The status appears below the name. Scroll when there are more contacts than fit on screen.</w:t>
       </w:r>
     </w:p>
     <w:p>
+      <w:pPr>
+        <w:keepLines/>
+      </w:pPr>
       <w:r>
         <w:t>A pulsing phone animation appears while the other end rings. After answer, Connecting video stays visible until the first remote video frame arrives. A brief wait can happen while the connection starts.</w:t>
       </w:r>
@@ -42,16 +48,25 @@
       </w:r>
     </w:p>
     <w:p>
+      <w:pPr>
+        <w:keepLines/>
+      </w:pPr>
       <w:r>
         <w:t>A red missed-call arrow and count on a contact portrait show calls you did not answer. A green return arrow means that person has asked you to call back; a green outgoing arrow means your request is pending. Tap the portrait for details or to clear missed calls.</w:t>
       </w:r>
     </w:p>
     <w:p>
+      <w:pPr>
+        <w:keepLines/>
+      </w:pPr>
       <w:r>
         <w:t>For an offline contact, tap the callback icon and choose Request callback. After an unanswered outgoing call, the app also offers Request callback. This sends a request through the Zmala server; it does not place another call. While your request is pending, the button becomes an X. Tap it to cancel the request; the callback button returns. This does not end or place a call.</w:t>
       </w:r>
     </w:p>
     <w:p>
+      <w:pPr>
+        <w:keepLines/>
+      </w:pPr>
       <w:r>
         <w:t>When the contact becomes available, tap their green Available or blue Try calling name to call. A connected call completes pending callback requests between you and clears your missed-call count for that person. The administrator controls request expiry. If the action is absent, the server needs an update to support app callbacks.</w:t>
       </w:r>
@@ -65,11 +80,17 @@
       </w:r>
     </w:p>
     <w:p>
+      <w:pPr>
+        <w:keepLines/>
+      </w:pPr>
       <w:r>
         <w:t>Use Answer or Decline on the incoming-call screen or notification. Incoming alerts can arrive while you use another app or the phone sleeps when notifications and server push are configured. Unlock the phone if Android requires it.</w:t>
       </w:r>
     </w:p>
     <w:p>
+      <w:pPr>
+        <w:keepLines/>
+      </w:pPr>
       <w:r>
         <w:t>Keep ZmalaPhone visible during an answered video call. Leaving the app ends its call media. After a deliberate Android Force stop, open the app again before expecting incoming calls.</w:t>
       </w:r>
@@ -83,6 +104,9 @@
       </w:r>
     </w:p>
     <w:p>
+      <w:pPr>
+        <w:keepLines/>
+      </w:pPr>
       <w:r>
         <w:t>To deliberately remove setup, use Android Settings &gt; Apps &gt; ZmalaPhone &gt; Storage &gt; Clear storage (sometimes Clear app data). This requires a setup QR again and does not delete the server account. Do not clear data as the first response to a temporary network problem.</w:t>
       </w:r>
@@ -96,18 +120,35 @@
       </w:r>
     </w:p>
     <w:p>
+      <w:pPr>
+        <w:keepLines/>
+      </w:pPr>
       <w:r>
         <w:t>The large picture shows the other person; the small view at bottom right shows your own camera. Rotate your phone for portrait or landscape. Tap the video to show the four round controls; they disappear after five seconds without interaction.</w:t>
       </w:r>
     </w:p>
     <w:p>
+      <w:pPr>
+        <w:keepLines/>
+      </w:pPr>
       <w:r>
-        <w:t>Microphone: mute or restore your microphone. Audio output: change where you hear the call. Switch camera: alternate the available front and rear cameras. Red hangup: end the call.</w:t>
+        <w:t>Microphone: tap to mute or restore what the other person hears. A slash across the microphone means your microphone is muted. The separate listening button cycles through loudspeaker (speaker with sound waves), earpiece (phone icon), and muted call sound (crossed speaker). Muting listening does not mute your microphone. Phones without an earpiece skip that choice. Brief text confirms each change.</w:t>
       </w:r>
     </w:p>
     <w:p>
+      <w:pPr>
+        <w:keepLines/>
+      </w:pPr>
       <w:r>
-        <w:t>Use the phone volume buttons to change listening volume. Camera switching changes your outgoing picture; it does not change the other person's camera.</w:t>
+        <w:t>Swipe upward on the video to raise listening volume, or downward to lower it. A percentage appears briefly. The phone volume buttons also change call volume. Each new call starts on the loudspeaker at your existing Android call volume; the app does not turn the volume up automatically. If a call sounds quiet, check the listening icon and raise call volume while the call is connected.</w:t>
+      </w:r>
+    </w:p>
+    <w:p>
+      <w:pPr>
+        <w:keepLines/>
+      </w:pPr>
+      <w:r>
+        <w:t>Switch camera: alternate the available front and rear cameras. The small preview follows the camera picture proportions and phone rotation. Camera switching changes your outgoing picture; it does not change the other person's camera. Red hangup ends the call.</w:t>
       </w:r>
     </w:p>
     <w:p>
@@ -119,21 +160,33 @@
       </w:r>
     </w:p>
     <w:p>
+      <w:pPr>
+        <w:keepLines/>
+      </w:pPr>
       <w:r>
         <w:t>No contacts or everyone offline: check your network connection and wait for the app to reconnect. Ask the administrator to check account groups and server availability. A phone and terminal need separate accounts in a shared calling group.</w:t>
       </w:r>
     </w:p>
     <w:p>
+      <w:pPr>
+        <w:keepLines/>
+      </w:pPr>
       <w:r>
         <w:t>No incoming alerts: enable notifications in Android Settings and reopen ZmalaPhone. Check internet access and ask the administrator whether the Firebase sender is configured. Open the app at least monthly to renew alerts.</w:t>
       </w:r>
     </w:p>
     <w:p>
+      <w:pPr>
+        <w:keepLines/>
+      </w:pPr>
       <w:r>
         <w:t>No sound or video: check camera and microphone permissions, microphone mute, listening volume and the camera lens. If Connecting video does not clear, end the call and retry; report which direction failed and whether sound worked.</w:t>
       </w:r>
     </w:p>
     <w:p>
+      <w:pPr>
+        <w:keepLines/>
+      </w:pPr>
       <w:r>
         <w:t>Calls work only on one network: ask the administrator to check secure remote access and whether your setup QR uses the HTTPS server address. A local-only server cannot support calls across arbitrary networks.</w:t>
       </w:r>
@@ -141,27 +194,40 @@
     <w:p>
       <w:pPr>
         <w:pStyle w:val="Heading1"/>
+        <w:pageBreakBefore/>
       </w:pPr>
       <w:r>
         <w:t>Updates</w:t>
       </w:r>
     </w:p>
     <w:p>
+      <w:pPr>
+        <w:keepLines/>
+      </w:pPr>
       <w:r>
         <w:t>The installed version appears discreetly at the bottom of the contact screen, beside Updates. Tap Updates to check now. When a newer published version is available, choose Update or Later. Later postpones reminders and automatic updates for a day.</w:t>
       </w:r>
     </w:p>
     <w:p>
+      <w:pPr>
+        <w:keepLines/>
+      </w:pPr>
       <w:r>
         <w:t>Allow installation from ZmalaPhone when Android opens Settings, then return and tap Update. Android 9 to 11 requires confirmation. Updates preserve your setup. If your older app has no Updates button, install one APK manually first; see ZmalaPhone-Installation.pdf.</w:t>
       </w:r>
     </w:p>
     <w:p>
+      <w:pPr>
+        <w:keepLines/>
+      </w:pPr>
       <w:r>
         <w:t>On Android 12 or later, Automatic updates on Wi-Fi is optional and initially off. It requires installation permission, an unmetered connection and 30 seconds with the app open and idle. If Android still requires approval, tap Update to continue.</w:t>
       </w:r>
     </w:p>
     <w:p>
+      <w:pPr>
+        <w:keepLines/>
+      </w:pPr>
       <w:r>
         <w:t>Updates wait during calls. Downloads pause when a call starts or you leave the app; reopen Updates to continue. Calls are briefly unavailable during installation. Do not uninstall the app for ordinary updates.</w:t>
       </w:r>

</xml_diff>

<commit_message>
Simplify phone contact actions and retain active calls across screens
</commit_message>
<xml_diff>
--- a/docs/phone_guide.docx
+++ b/docs/phone_guide.docx
@@ -28,7 +28,7 @@
         <w:keepLines/>
       </w:pPr>
       <w:r>
-        <w:t>The contact screen stays in portrait. Contacts appear with a photo and name. Green Available means the contact was recently active. Blue Try calling means push may reach their phone, but this is unconfirmed. Tap either to try a call. Red Offline means no current connection or usable push registration; it cannot start a call. The status appears below the name. Scroll when there are more contacts than fit on screen.</w:t>
+        <w:t>The contact list stays in portrait. Each person has one tappable card with a rounded photo, name, availability and any call notices. Tap the card to open that person’s page. Tap Call there to start the call; opening a card alone never calls.</w:t>
       </w:r>
     </w:p>
     <w:p>
@@ -36,7 +36,15 @@
         <w:keepLines/>
       </w:pPr>
       <w:r>
-        <w:t>A pulsing phone animation appears while the other end rings. After answer, Connecting video stays visible until the first remote video frame arrives. A brief wait can happen while the connection starts.</w:t>
+        <w:t>Green Available means recently active. Blue Try calling means push may reach the phone, but this is unconfirmed. Red Offline cards can still open for callbacks, while their Call button is disabled. Long names and notices wrap; short lists are centred and longer lists scroll.</w:t>
+      </w:r>
+    </w:p>
+    <w:p>
+      <w:pPr>
+        <w:keepLines/>
+      </w:pPr>
+      <w:r>
+        <w:t>The person’s page offers Call, Request callback or Cancel request, and Clear missed calls where needed. Contacts or Android Back returns to the list. The app uses your phone’s English or French language and supports larger Android text settings.</w:t>
       </w:r>
     </w:p>
     <w:p>
@@ -44,7 +52,7 @@
         <w:pStyle w:val="Heading1"/>
       </w:pPr>
       <w:r>
-        <w:t>Missed calls and callback requests</w:t>
+        <w:t>Missed calls and callbacks</w:t>
       </w:r>
     </w:p>
     <w:p>
@@ -52,7 +60,7 @@
         <w:keepLines/>
       </w:pPr>
       <w:r>
-        <w:t>A red missed-call arrow and count on a contact portrait show calls you did not answer. A green return arrow means that person has asked you to call back; a green outgoing arrow means your request is pending. Tap the portrait for details or to clear missed calls.</w:t>
+        <w:t>Readable notices distinguish Please call back (someone wants you to call them), Callback requested (your request is pending), and missed-call counts. Both directions can appear together. They stay visible beside that person’s name and on their page.</w:t>
       </w:r>
     </w:p>
     <w:p>
@@ -60,7 +68,7 @@
         <w:keepLines/>
       </w:pPr>
       <w:r>
-        <w:t>For an offline contact, tap the callback icon and choose Request callback. After an unanswered outgoing call, the app also offers Request callback. This sends a request through the Zmala server; it does not place another call. While your request is pending, the button becomes an X. Tap it to cancel the request; the callback button returns. This does not end or place a call.</w:t>
+        <w:t>Open an offline contact’s page and choose Request callback to ask them to call you later. The same action changes to Cancel request after server confirmation. Cancelling removes only your pending request. A failed action keeps its last confirmed state and can be retried.</w:t>
       </w:r>
     </w:p>
     <w:p>
@@ -68,7 +76,7 @@
         <w:keepLines/>
       </w:pPr>
       <w:r>
-        <w:t>When the contact becomes available, tap their green Available or blue Try calling name to call. A connected call completes pending callback requests between you and clears your missed-call count for that person. The administrator controls request expiry. If the action is absent, the server needs an update to support app callbacks.</w:t>
+        <w:t>After an unanswered, declined or cancelled outgoing call, the app also offers to request a callback. Clear missed calls removes that person’s local count; a connected call clears it too. Callback features require support on the server.</w:t>
       </w:r>
     </w:p>
     <w:p>
@@ -76,7 +84,7 @@
         <w:pStyle w:val="Heading1"/>
       </w:pPr>
       <w:r>
-        <w:t>Answer an incoming call</w:t>
+        <w:t>Receive calls</w:t>
       </w:r>
     </w:p>
     <w:p>
@@ -84,7 +92,7 @@
         <w:keepLines/>
       </w:pPr>
       <w:r>
-        <w:t>Use Answer or Decline on the incoming-call screen or notification. Incoming alerts can arrive while you use another app or the phone sleeps when notifications and server push are configured. Unlock the phone if Android requires it.</w:t>
+        <w:t>An incoming call shows the caller’s portrait and name with separate Answer video call and Decline actions. While the app is closed or the phone sleeps, Android shows an incoming-call notification when alerts are available. Answer or Video reconnects and answers that specific authorized call.</w:t>
       </w:r>
     </w:p>
     <w:p>
@@ -92,23 +100,7 @@
         <w:keepLines/>
       </w:pPr>
       <w:r>
-        <w:t>Keep ZmalaPhone visible during an answered video call. Leaving the app ends its call media. After a deliberate Android Force stop, open the app again before expecting incoming calls.</w:t>
-      </w:r>
-    </w:p>
-    <w:p>
-      <w:pPr>
-        <w:pStyle w:val="Heading1"/>
-      </w:pPr>
-      <w:r>
-        <w:t>Reset setup only when needed</w:t>
-      </w:r>
-    </w:p>
-    <w:p>
-      <w:pPr>
-        <w:keepLines/>
-      </w:pPr>
-      <w:r>
-        <w:t>To deliberately remove setup, use Android Settings &gt; Apps &gt; ZmalaPhone &gt; Storage &gt; Clear storage (sometimes Clear app data). This requires a setup QR again and does not delete the server account. Do not clear data as the first response to a temporary network problem.</w:t>
+        <w:t>Once answered, Home, switching apps or locking the screen keeps audio running. Camera sending pauses while the screen is hidden and resumes when you return. The ongoing call notification lets you return or end the call. Android Force stop or stopping the call service ends it; reopen the app afterward for incoming alerts.</w:t>
       </w:r>
     </w:p>
     <w:p>
@@ -124,7 +116,7 @@
         <w:keepLines/>
       </w:pPr>
       <w:r>
-        <w:t>The large picture shows the other person; the small view at bottom right shows your own camera. Rotate your phone for portrait or landscape. Tap the video to show the four round controls; they disappear after five seconds without interaction.</w:t>
+        <w:t>The large picture shows the other person; your small preview is at bottom right. Rotate for portrait or landscape. Tap the video to reveal four round buttons with short labels. They normally hide after five seconds; accessibility settings or keyboard focus can keep them visible longer. The first call briefly explains tap and volume gestures.</w:t>
       </w:r>
     </w:p>
     <w:p>
@@ -132,7 +124,7 @@
         <w:keepLines/>
       </w:pPr>
       <w:r>
-        <w:t>Microphone: tap to mute or restore what the other person hears. A slash across the microphone means your microphone is muted. The separate listening button cycles through loudspeaker (speaker with sound waves), earpiece (phone icon), and muted call sound (crossed speaker). Muting listening does not mute your microphone. Phones without an earpiece skip that choice. Brief text confirms each change.</w:t>
+        <w:t>Mic mutes or restores what the other person hears. A slash and a persistent Microphone muted notice indicate mute. Sound cycles loudspeaker, earpiece and muted received sound, skipping an unavailable earpiece. A persistent Sound muted notice distinguishes this from microphone mute.</w:t>
       </w:r>
     </w:p>
     <w:p>
@@ -140,7 +132,7 @@
         <w:keepLines/>
       </w:pPr>
       <w:r>
-        <w:t>Swipe upward on the video to raise listening volume, or downward to lower it. A percentage appears briefly. The phone volume buttons also change call volume. Each new call starts on the loudspeaker at your existing Android call volume; the app does not turn the volume up automatically. If a call sounds quiet, check the listening icon and raise call volume while the call is connected.</w:t>
+        <w:t>Swipe upward on video to raise listening volume, or downward to lower it. A percentage appears briefly. Hardware volume buttons also adjust call volume. New calls use loudspeaker at the existing Android call volume; raise it during the call if necessary.</w:t>
       </w:r>
     </w:p>
     <w:p>
@@ -148,7 +140,7 @@
         <w:keepLines/>
       </w:pPr>
       <w:r>
-        <w:t>Switch camera: alternate the available front and rear cameras. The small preview follows the camera picture proportions and phone rotation. Camera switching changes your outgoing picture; it does not change the other person's camera. Red hangup ends the call.</w:t>
+        <w:t>Camera switches between front and rear cameras. Your preview preserves proportions and follows rotation. End hangs up. Ringing pulses before answer. After answer, Connecting video is shown for up to fifteen seconds; if video is late, a calm message replaces the spinner without ending the call.</w:t>
       </w:r>
     </w:p>
     <w:p>
@@ -164,7 +156,7 @@
         <w:keepLines/>
       </w:pPr>
       <w:r>
-        <w:t>No contacts or everyone offline: check your network connection and wait for the app to reconnect. Ask the administrator to check account groups and server availability. A phone and terminal need separate accounts in a shared calling group.</w:t>
+        <w:t>A reconnecting notice means the server is temporarily unreachable. Check the network and allow time to reconnect. An established call stays connected during a temporary configuration outage; revoked account access still stops it. Ask the person who supplied your QR for help with account or group problems.</w:t>
       </w:r>
     </w:p>
     <w:p>
@@ -172,7 +164,7 @@
         <w:keepLines/>
       </w:pPr>
       <w:r>
-        <w:t>No incoming alerts: enable notifications in Android Settings and reopen ZmalaPhone. Check internet access and ask the administrator whether the Firebase sender is configured. Open the app at least monthly to renew alerts.</w:t>
+        <w:t>If incoming alerts are unavailable, use the contact footer’s Enable notifications, Try again or Details action. Check internet access and reopen after a deliberate Force stop. Physical phone battery policies and locked-screen behavior should be checked before handover.</w:t>
       </w:r>
     </w:p>
     <w:p>
@@ -180,15 +172,7 @@
         <w:keepLines/>
       </w:pPr>
       <w:r>
-        <w:t>No sound or video: check camera and microphone permissions, microphone mute, listening volume and the camera lens. If Connecting video does not clear, end the call and retry; report which direction failed and whether sound worked.</w:t>
-      </w:r>
-    </w:p>
-    <w:p>
-      <w:pPr>
-        <w:keepLines/>
-      </w:pPr>
-      <w:r>
-        <w:t>Calls work only on one network: ask the administrator to check secure remote access and whether your setup QR uses the HTTPS server address. A local-only server cannot support calls across arbitrary networks.</w:t>
+        <w:t>For missing sound or video, check permissions, microphone mute, listening mute/volume and the camera lens. Delayed video can still arrive. If it does not, end the call and retry, noting the direction and whether sound worked. Calls across different networks need the server’s secure relay configuration and an HTTPS setup QR.</w:t>
       </w:r>
     </w:p>
     <w:p>
@@ -205,7 +189,7 @@
         <w:keepLines/>
       </w:pPr>
       <w:r>
-        <w:t>The installed version appears discreetly at the bottom of the contact screen, beside Updates. Tap Updates to check now. When a newer published version is available, choose Update or Later. Later postpones reminders and automatic updates for a day.</w:t>
+        <w:t>The installed version appears discreetly only at the bottom of the contact list. Updates changes to Update available when a newer release is found, without opening a dialog over your contacts. Tap it to view details and choose Update or Later. Later defers prompting and automatic work for a day.</w:t>
       </w:r>
     </w:p>
     <w:p>
@@ -213,7 +197,7 @@
         <w:keepLines/>
       </w:pPr>
       <w:r>
-        <w:t>Allow installation from ZmalaPhone when Android opens Settings, then return and tap Update. Android 9 to 11 requires confirmation. Updates preserve your setup. If your older app has no Updates button, install one APK manually first; see ZmalaPhone-Installation.pdf.</w:t>
+        <w:t>A selected update shows download percentage followed by Checking update, Preparing installation and Installing update. Allow installation from ZmalaPhone if Android requests it. Android may need confirmation. Updates keep setup; do not uninstall for an ordinary update.</w:t>
       </w:r>
     </w:p>
     <w:p>
@@ -221,7 +205,7 @@
         <w:keepLines/>
       </w:pPr>
       <w:r>
-        <w:t>On Android 12 or later, Automatic updates on Wi-Fi is optional and initially off. It requires installation permission, an unmetered connection and 30 seconds with the app open and idle. If Android still requires approval, tap Update to continue.</w:t>
+        <w:t>On Android 12 or later, optional Automatic updates on Wi-Fi starts off. It requires installation permission, an unmetered connection and thirty seconds of visible idle time. Touching the app restarts the idle timer; a person’s action page and all ringing/connected calls postpone installation.</w:t>
       </w:r>
     </w:p>
     <w:p>
@@ -229,7 +213,7 @@
         <w:keepLines/>
       </w:pPr>
       <w:r>
-        <w:t>Updates wait during calls. Downloads pause when a call starts or you leave the app; reopen Updates to continue. Calls are briefly unavailable during installation. Do not uninstall the app for ordinary updates.</w:t>
+        <w:t>Downloads pause when a call starts or the app backgrounds. Reopen Updates to continue. Installation briefly makes new calls unavailable. Android 9–11 requires manual confirmation. If the installed app has no Updates action, install one newer APK manually first.</w:t>
       </w:r>
     </w:p>
     <w:sectPr>

</xml_diff>

<commit_message>
Align component behavior and requirements; simplify user guides
</commit_message>
<xml_diff>
--- a/docs/phone_guide.docx
+++ b/docs/phone_guide.docx
@@ -12,7 +12,7 @@
     </w:p>
     <w:p>
       <w:r>
-        <w:t>For everyday video calls after your phone has been set up. If the welcome screen still asks for a setup QR, follow ZmalaPhone-Installation.pdf first.</w:t>
+        <w:t>Tap someone’s contact card, then Call. This guide explains everyday calls, callbacks and updates. If the app still asks for a setup QR, follow ZmalaPhone-Installation.pdf first.</w:t>
       </w:r>
     </w:p>
     <w:p>
@@ -28,7 +28,7 @@
         <w:keepLines/>
       </w:pPr>
       <w:r>
-        <w:t>The contact list stays in portrait. Each person has one tappable card with a rounded photo, name, availability and any call notices. Tap the card to open that person’s page. Tap Call there to start the call; opening a card alone never calls.</w:t>
+        <w:t>The contact list stays upright in portrait. Tap a person’s card to open their page, then tap Call. Opening the card does not start a call. Swipe the list to see more people.</w:t>
       </w:r>
     </w:p>
     <w:p>
@@ -36,7 +36,7 @@
         <w:keepLines/>
       </w:pPr>
       <w:r>
-        <w:t>Green Available means recently active. Blue Try calling means push may reach the phone, but this is unconfirmed. Red Offline cards can still open for callbacks, while their Call button is disabled. Long names and notices wrap; short lists are centred and longer lists scroll.</w:t>
+        <w:t>Green Available means the person’s device was recently active. Blue Try calling means a phone alert may reach them, but this is not certain. You can try either. Red Offline means Call is unavailable; you can still open the card and request a callback.</w:t>
       </w:r>
     </w:p>
     <w:p>
@@ -44,39 +44,7 @@
         <w:keepLines/>
       </w:pPr>
       <w:r>
-        <w:t>The person’s page offers Call, Request callback or Cancel request, and Clear missed calls where needed. Contacts or Android Back returns to the list. The app uses your phone’s English or French language and supports larger Android text settings.</w:t>
-      </w:r>
-    </w:p>
-    <w:p>
-      <w:pPr>
-        <w:pStyle w:val="Heading1"/>
-      </w:pPr>
-      <w:r>
-        <w:t>Missed calls and callbacks</w:t>
-      </w:r>
-    </w:p>
-    <w:p>
-      <w:pPr>
-        <w:keepLines/>
-      </w:pPr>
-      <w:r>
-        <w:t>Please call back marks an incoming request; Callback requested marks one you sent. Both may appear with missed-call counts. An incoming request also creates an Android notification naming the requester. Tap it to open their contact without calling. Requests do not repeatedly alert; cancellation, a completed call or expiry removes the alert. Manage Callback requests separately in Android notification settings.</w:t>
-      </w:r>
-    </w:p>
-    <w:p>
-      <w:pPr>
-        <w:keepLines/>
-      </w:pPr>
-      <w:r>
-        <w:t>Open an offline contact’s page and choose Request callback to ask them to call you later. The same action changes to Cancel request after server confirmation. Cancelling removes only your pending request. A failed action keeps its last confirmed state and can be retried.</w:t>
-      </w:r>
-    </w:p>
-    <w:p>
-      <w:pPr>
-        <w:keepLines/>
-      </w:pPr>
-      <w:r>
-        <w:t>After an unanswered, declined or cancelled outgoing call, the app also offers to request a callback. Clear missed calls removes that person’s local count; a connected call clears it too. Callback features require support on the server.</w:t>
+        <w:t>Tap Contacts or use Android Back to return to the list. The app follows the phone’s English or French language and supports Android’s larger text settings.</w:t>
       </w:r>
     </w:p>
     <w:p>
@@ -92,7 +60,7 @@
         <w:keepLines/>
       </w:pPr>
       <w:r>
-        <w:t>An incoming call shows the caller’s portrait and name with separate Answer video call and Decline actions. While the app is closed or the phone sleeps, Android shows an incoming-call notification when alerts are available. Answer or Video reconnects and answers that specific authorized call.</w:t>
+        <w:t>An incoming call shows the caller’s name and picture. Tap Answer video call to accept or Decline to refuse. When the app is closed or the phone is asleep, use the incoming-call notification’s Answer or Video action.</w:t>
       </w:r>
     </w:p>
     <w:p>
@@ -100,7 +68,7 @@
         <w:keepLines/>
       </w:pPr>
       <w:r>
-        <w:t>Once answered, Home, switching apps or locking the screen keeps audio running. Camera sending pauses while the screen is hidden and resumes when you return. The ongoing call notification lets you return or end the call. Android Force stop or stopping the call service ends it; reopen the app afterward for incoming alerts.</w:t>
+        <w:t>After answering, you can return Home, switch apps or lock the screen: sound continues and your camera pauses. Tap the ongoing-call notification to return. Your camera resumes when the call is visible again. The notification also lets you end the call.</w:t>
       </w:r>
     </w:p>
     <w:p>
@@ -116,7 +84,7 @@
         <w:keepLines/>
       </w:pPr>
       <w:r>
-        <w:t>The large picture shows the other person; your small preview is at bottom right. Rotate for portrait or landscape. Tap the video to reveal four round buttons with short labels. They normally hide after five seconds; accessibility settings or keyboard focus can keep them visible longer. The first call briefly explains tap and volume gestures.</w:t>
+        <w:t>The large picture shows the other person; the small picture in the bottom-right corner shows you. Rotate the phone for a wider view. Tap the video to show the four controls. They usually hide again after five seconds.</w:t>
       </w:r>
     </w:p>
     <w:p>
@@ -124,7 +92,7 @@
         <w:keepLines/>
       </w:pPr>
       <w:r>
-        <w:t>Mic mutes or restores what the other person hears. A slash and a persistent Microphone muted notice indicate mute. Sound cycles loudspeaker, earpiece and muted received sound, skipping an unavailable earpiece. A persistent Sound muted notice distinguishes this from microphone mute.</w:t>
+        <w:t>Mic: stop or restore the sound you send. Microphone muted stays visible while the other person cannot hear you.</w:t>
       </w:r>
     </w:p>
     <w:p>
@@ -132,7 +100,7 @@
         <w:keepLines/>
       </w:pPr>
       <w:r>
-        <w:t>Swipe upward on video to raise listening volume, or downward to lower it. A percentage appears briefly. Hardware volume buttons also adjust call volume. New calls use loudspeaker at the existing Android call volume; raise it during the call if necessary.</w:t>
+        <w:t>Sound: switch between loudspeaker, earpiece and muted listening. Phones without an earpiece skip that choice. Sound muted means you cannot hear the other person; it does not mute your microphone.</w:t>
       </w:r>
     </w:p>
     <w:p>
@@ -140,15 +108,7 @@
         <w:keepLines/>
       </w:pPr>
       <w:r>
-        <w:t>Camera switches between front and rear cameras. Your preview preserves proportions and follows rotation. End hangs up. Ringing pulses before answer. After answer, Connecting video is shown for up to fifteen seconds; if video is late, a calm message replaces the spinner without ending the call.</w:t>
-      </w:r>
-    </w:p>
-    <w:p>
-      <w:pPr>
-        <w:pStyle w:val="Heading1"/>
-      </w:pPr>
-      <w:r>
-        <w:t>When something is not working</w:t>
+        <w:t>Camera: switch between front and back cameras. End: finish the call.</w:t>
       </w:r>
     </w:p>
     <w:p>
@@ -156,7 +116,7 @@
         <w:keepLines/>
       </w:pPr>
       <w:r>
-        <w:t>A reconnecting notice means the server is temporarily unreachable. Check the network and allow time to reconnect. An established call stays connected during a temporary configuration outage; revoked account access still stops it. Ask the person who supplied your QR for help with account or group problems.</w:t>
+        <w:t>Swipe up on the video for louder sound or down for quieter sound. The phone’s volume buttons also work during a call. A new call uses loudspeaker at the existing Android call volume, so raise it here if it is too quiet.</w:t>
       </w:r>
     </w:p>
     <w:p>
@@ -164,15 +124,7 @@
         <w:keepLines/>
       </w:pPr>
       <w:r>
-        <w:t>If incoming alerts are unavailable, use the contact footer’s Enable notifications, Try again or Details action. Check internet access and reopen after a deliberate Force stop. Physical phone battery policies and locked-screen behavior should be checked before handover.</w:t>
-      </w:r>
-    </w:p>
-    <w:p>
-      <w:pPr>
-        <w:keepLines/>
-      </w:pPr>
-      <w:r>
-        <w:t>For missing sound or video, check permissions, microphone mute, listening mute/volume and the camera lens. Delayed video can still arrive. If it does not, end the call and retry, noting the direction and whether sound worked. Calls across different networks need the server’s secure relay configuration and an HTTPS setup QR.</w:t>
+        <w:t>Video can take a few seconds after answer. Connecting video appears for up to fifteen seconds; a later message does not end the call. You can keep talking while waiting.</w:t>
       </w:r>
     </w:p>
     <w:p>
@@ -181,7 +133,7 @@
         <w:pageBreakBefore/>
       </w:pPr>
       <w:r>
-        <w:t>Updates</w:t>
+        <w:t>Missed calls and callbacks</w:t>
       </w:r>
     </w:p>
     <w:p>
@@ -189,7 +141,7 @@
         <w:keepLines/>
       </w:pPr>
       <w:r>
-        <w:t>The installed version appears discreetly only at the bottom of the contact list. Updates changes to Update available when a newer release is found, without opening a dialog over your contacts. Tap it to view details and choose Update or Later. Later defers prompting and automatic work for a day.</w:t>
+        <w:t>A missed-call count appears beside the contact. Open their page to call back or choose Clear missed calls. A connected call also clears that person’s count.</w:t>
       </w:r>
     </w:p>
     <w:p>
@@ -197,7 +149,7 @@
         <w:keepLines/>
       </w:pPr>
       <w:r>
-        <w:t>A selected update shows download percentage followed by Checking update, Preparing installation and Installing update. Allow installation from ZmalaPhone if Android requests it. Android may need confirmation. Updates keep setup; do not uninstall for an ordinary update.</w:t>
+        <w:t>To ask someone to call later, open their page and tap Request callback. You can do this for an offline contact, or accept the offer after an unanswered, declined or cancelled call. Wait for confirmation. The button then becomes Cancel request.</w:t>
       </w:r>
     </w:p>
     <w:p>
@@ -205,7 +157,7 @@
         <w:keepLines/>
       </w:pPr>
       <w:r>
-        <w:t>On Android 12 or later, optional Automatic updates on Wi-Fi starts off. It requires installation permission, an unmetered connection and thirty seconds of visible idle time. Touching the app restarts the idle timer; a person’s action page and all ringing/connected calls postpone installation.</w:t>
+        <w:t>Changed your mind? Tap Cancel request on the same person’s page. This cancels your pending request, not a request they sent you. If saving fails, check the connection and retry.</w:t>
       </w:r>
     </w:p>
     <w:p>
@@ -213,7 +165,88 @@
         <w:keepLines/>
       </w:pPr>
       <w:r>
-        <w:t>Downloads pause when a call starts or the app backgrounds. Reopen Updates to continue. Installation briefly makes new calls unavailable. Android 9–11 requires manual confirmation. If the installed app has no Updates action, install one newer APK manually first.</w:t>
+        <w:t>Please call back means someone asked you to call them. Callback requested means you asked them. Incoming requests can also appear as Android notifications. Tapping one opens the contact without calling; choose Call when ready. A completed call, cancellation or expiry removes the reminder.</w:t>
+      </w:r>
+    </w:p>
+    <w:p>
+      <w:pPr>
+        <w:pStyle w:val="Heading1"/>
+      </w:pPr>
+      <w:r>
+        <w:t>Keep the app up to date</w:t>
+      </w:r>
+    </w:p>
+    <w:p>
+      <w:pPr>
+        <w:keepLines/>
+      </w:pPr>
+      <w:r>
+        <w:t>The version number is at the bottom of the contact list. Tap Updates, or Update available when shown. Choose Update to download, or Later to postpone for a day.</w:t>
+      </w:r>
+    </w:p>
+    <w:p>
+      <w:pPr>
+        <w:keepLines/>
+      </w:pPr>
+      <w:r>
+        <w:t>Wait through Checking update, Preparing installation and Installing update. Allow installation from ZmalaPhone if Android asks, then confirm installation if required. Your setup is kept. Do not uninstall for an ordinary update.</w:t>
+      </w:r>
+    </w:p>
+    <w:p>
+      <w:pPr>
+        <w:keepLines/>
+      </w:pPr>
+      <w:r>
+        <w:t>On supported Android 12 or newer phones, you can turn on Automatic updates on Wi-Fi. It starts off. It needs installation permission, an unmetered connection and thirty seconds without interaction on the visible contact list. Android may still ask for confirmation.</w:t>
+      </w:r>
+    </w:p>
+    <w:p>
+      <w:pPr>
+        <w:keepLines/>
+      </w:pPr>
+      <w:r>
+        <w:t>Ringing and connected calls postpone updates. Leaving the app pauses a download; reopen Updates to continue. Installation briefly makes incoming calls unavailable. On Android 9 to 11, confirm updates manually.</w:t>
+      </w:r>
+    </w:p>
+    <w:p>
+      <w:pPr>
+        <w:pStyle w:val="Heading1"/>
+        <w:pageBreakBefore/>
+      </w:pPr>
+      <w:r>
+        <w:t>Get help</w:t>
+      </w:r>
+    </w:p>
+    <w:p>
+      <w:pPr>
+        <w:keepLines/>
+      </w:pPr>
+      <w:r>
+        <w:t>Cannot hear the other person: tap the video, check Sound is not muted and raise call volume. If they cannot hear you, check Mic is not muted and Android allows microphone access.</w:t>
+      </w:r>
+    </w:p>
+    <w:p>
+      <w:pPr>
+        <w:keepLines/>
+      </w:pPr>
+      <w:r>
+        <w:t>No video: allow camera access, uncover the lens and wait briefly. If the picture does not arrive, end the call and try again. Tell your helper which device had no picture and whether sound worked.</w:t>
+      </w:r>
+    </w:p>
+    <w:p>
+      <w:pPr>
+        <w:keepLines/>
+      </w:pPr>
+      <w:r>
+        <w:t>No incoming alerts: check internet access and the message at the bottom of Contacts. Use Enable notifications, Try again or Details as offered. Reopen after Android Force stop. Ask your helper to test calls with the screen locked and review battery-saving settings.</w:t>
+      </w:r>
+    </w:p>
+    <w:p>
+      <w:pPr>
+        <w:keepLines/>
+      </w:pPr>
+      <w:r>
+        <w:t>Reconnecting: check the phone’s network and allow time to reconnect. A temporary server outage need not end an established call. Ask the person who supplied your QR about missing contacts or account access. Do not clear storage as a first troubleshooting step.</w:t>
       </w:r>
     </w:p>
     <w:sectPr>
@@ -675,7 +708,7 @@
       <w:rFonts w:asciiTheme="majorHAnsi" w:eastAsiaTheme="majorEastAsia" w:hAnsiTheme="majorHAnsi" w:cstheme="majorBidi" w:ascii="Calibri" w:hAnsi="Calibri"/>
       <w:b/>
       <w:bCs/>
-      <w:color w:val="16734B"/>
+      <w:color w:val="000000"/>
       <w:sz w:val="32"/>
       <w:szCs w:val="28"/>
     </w:rPr>
@@ -959,7 +992,7 @@
     </w:pPr>
     <w:rPr>
       <w:rFonts w:asciiTheme="majorHAnsi" w:eastAsiaTheme="majorEastAsia" w:hAnsiTheme="majorHAnsi" w:cstheme="majorBidi" w:ascii="Calibri" w:hAnsi="Calibri"/>
-      <w:color w:val="1F2937"/>
+      <w:color w:val="000000"/>
       <w:spacing w:val="5"/>
       <w:kern w:val="28"/>
       <w:sz w:val="54"/>

</xml_diff>

<commit_message>
Add private in-call photo sharing from Android to terminals
</commit_message>
<xml_diff>
--- a/docs/phone_guide.docx
+++ b/docs/phone_guide.docx
@@ -130,7 +130,38 @@
     <w:p>
       <w:pPr>
         <w:pStyle w:val="Heading1"/>
-        <w:pageBreakBefore/>
+      </w:pPr>
+      <w:r>
+        <w:t>Show a photo during a call</w:t>
+      </w:r>
+    </w:p>
+    <w:p>
+      <w:pPr>
+        <w:keepLines/>
+      </w:pPr>
+      <w:r>
+        <w:t>While talking to someone using a TV terminal, tap Share photo and choose a picture on your phone. You can keep talking while the picture picker is open. Cancel the picker if you do not want to share.</w:t>
+      </w:r>
+    </w:p>
+    <w:p>
+      <w:pPr>
+        <w:keepLines/>
+      </w:pPr>
+      <w:r>
+        <w:t>The picture appears on both screens, keeping its proportions. It covers both video views, but sound and call controls still work. Tap Stop sharing to return to video. To show another picture, stop sharing and choose again.</w:t>
+      </w:r>
+    </w:p>
+    <w:p>
+      <w:pPr>
+        <w:keepLines/>
+      </w:pPr>
+      <w:r>
+        <w:t>This needs updated software on the phone, terminal and server. It is not available for phone-to-phone calls. The photo is temporary: it is not saved to the other person’s album or used as a portrait. If sharing loses its connection, video returns after a short delay. Ending the call also clears the picture.</w:t>
+      </w:r>
+    </w:p>
+    <w:p>
+      <w:pPr>
+        <w:pStyle w:val="Heading1"/>
       </w:pPr>
       <w:r>
         <w:t>Missed calls and callbacks</w:t>

</xml_diff>

<commit_message>
Support sender-owned photo sharing between Android apps
</commit_message>
<xml_diff>
--- a/docs/phone_guide.docx
+++ b/docs/phone_guide.docx
@@ -140,7 +140,7 @@
         <w:keepLines/>
       </w:pPr>
       <w:r>
-        <w:t>While talking to someone using a TV terminal, tap Share photo and choose a picture on your phone. You can keep talking while the picture picker is open. Cancel the picker if you do not want to share.</w:t>
+        <w:t>During a call to a phone or TV terminal, tap Share photo and choose a picture on your phone. You can keep talking while the picture picker is open. Cancel the picker if you do not want to share.</w:t>
       </w:r>
     </w:p>
     <w:p>
@@ -156,7 +156,7 @@
         <w:keepLines/>
       </w:pPr>
       <w:r>
-        <w:t>This needs updated software on the phone, terminal and server. It is not available for phone-to-phone calls. The photo is temporary: it is not saved to the other person’s album or used as a portrait. If sharing loses its connection, video returns after a short delay. Ending the call also clears the picture.</w:t>
+        <w:t>This needs updated software on both devices and the server. Only one person can share at a time; on phones, either person can share after the previous sender stops. The photo is temporary: it is not saved to the other person’s album or used as a portrait. If sharing loses its connection, video returns after a short delay. Ending the call also clears the picture.</w:t>
       </w:r>
     </w:p>
     <w:p>

</xml_diff>

<commit_message>
Share photos during app and terminal calls (#68)
* Plan in-call App-to-Terminal photo sharing

Refs #67. Record architecture, lifecycle/privacy boundaries and verification checklist; runtime implementation is pending.

* Add private in-call photo sharing from Android to terminals

* Support sender-owned photo sharing between Android apps

---------

Co-authored-by: acolin <acolin@rapitasystems.com>
</commit_message>
<xml_diff>
--- a/docs/phone_guide.docx
+++ b/docs/phone_guide.docx
@@ -130,7 +130,38 @@
     <w:p>
       <w:pPr>
         <w:pStyle w:val="Heading1"/>
-        <w:pageBreakBefore/>
+      </w:pPr>
+      <w:r>
+        <w:t>Show a photo during a call</w:t>
+      </w:r>
+    </w:p>
+    <w:p>
+      <w:pPr>
+        <w:keepLines/>
+      </w:pPr>
+      <w:r>
+        <w:t>During a call to a phone or TV terminal, tap Share photo and choose a picture on your phone. You can keep talking while the picture picker is open. Cancel the picker if you do not want to share.</w:t>
+      </w:r>
+    </w:p>
+    <w:p>
+      <w:pPr>
+        <w:keepLines/>
+      </w:pPr>
+      <w:r>
+        <w:t>The picture appears on both screens, keeping its proportions. It covers both video views, but sound and call controls still work. Tap Stop sharing to return to video. To show another picture, stop sharing and choose again.</w:t>
+      </w:r>
+    </w:p>
+    <w:p>
+      <w:pPr>
+        <w:keepLines/>
+      </w:pPr>
+      <w:r>
+        <w:t>This needs updated software on both devices and the server. Only one person can share at a time; on phones, either person can share after the previous sender stops. The photo is temporary: it is not saved to the other person’s album or used as a portrait. If sharing loses its connection, video returns after a short delay. Ending the call also clears the picture.</w:t>
+      </w:r>
+    </w:p>
+    <w:p>
+      <w:pPr>
+        <w:pStyle w:val="Heading1"/>
       </w:pPr>
       <w:r>
         <w:t>Missed calls and callbacks</w:t>

</xml_diff>